<commit_message>
Decision log (DL-001 to DL-029); OI-31 to OI-35 decided as working defaults
Retention, pricing, parent sign-in, AI hosting and framework decisions made
from Australian market practice and published rules, with sources and the
stage each must be validated before. BRD v2.3 Appendix C statuses updated.

Co-Authored-By: Claude Sonnet 5.5 <noreply@anthropic.com>
</commit_message>
<xml_diff>
--- a/Requirement and design/Next_Gen_Childcare_BRD_v2.3.docx
+++ b/Requirement and design/Next_Gen_Childcare_BRD_v2.3.docx
@@ -34495,7 +34495,7 @@
                 <w:sz w:val="18"/>
                 <w:szCs w:val="18"/>
               </w:rPr>
-              <w:t xml:space="preserve">Open</w:t>
+              <w:t xml:space="preserve">Working default 11 Oct 2026 (DL-025)</w:t>
             </w:r>
           </w:p>
         </w:tc>
@@ -34632,7 +34632,7 @@
                 <w:sz w:val="18"/>
                 <w:szCs w:val="18"/>
               </w:rPr>
-              <w:t xml:space="preserve">Open</w:t>
+              <w:t xml:space="preserve">Working default 11 Oct 2026 (DL-026)</w:t>
             </w:r>
           </w:p>
         </w:tc>
@@ -34769,7 +34769,7 @@
                 <w:sz w:val="18"/>
                 <w:szCs w:val="18"/>
               </w:rPr>
-              <w:t xml:space="preserve">Open</w:t>
+              <w:t xml:space="preserve">Working default 11 Oct 2026 (DL-027)</w:t>
             </w:r>
           </w:p>
         </w:tc>
@@ -34906,7 +34906,7 @@
                 <w:sz w:val="18"/>
                 <w:szCs w:val="18"/>
               </w:rPr>
-              <w:t xml:space="preserve">Open</w:t>
+              <w:t xml:space="preserve">Working default 11 Oct 2026 (DL-028)</w:t>
             </w:r>
           </w:p>
         </w:tc>
@@ -35043,7 +35043,7 @@
                 <w:sz w:val="18"/>
                 <w:szCs w:val="18"/>
               </w:rPr>
-              <w:t xml:space="preserve">Open</w:t>
+              <w:t xml:space="preserve">Working default 11 Oct 2026 (DL-029)</w:t>
             </w:r>
           </w:p>
         </w:tc>

</xml_diff>